<commit_message>
Standardize Full Stack Developer title
</commit_message>
<xml_diff>
--- a/Saman_Khan_CV.docx
+++ b/Saman_Khan_CV.docx
@@ -30,7 +30,7 @@
           <w:sz w:val="26"/>
           <w:szCs w:val="26"/>
         </w:rPr>
-        <w:t xml:space="preserve">Full Stack Software Engineer</w:t>
+        <w:t xml:space="preserve">Full Stack Developer</w:t>
       </w:r>
     </w:p>
     <w:p>
@@ -109,7 +109,7 @@
           <w:sz w:val="20"/>
           <w:szCs w:val="20"/>
         </w:rPr>
-        <w:t xml:space="preserve">Full Stack Software Engineer with 2+ years building data-intensive internal platforms and subscription portals at scale — currently at a Dubai-based mobility startup. Specialises in React, Node.js, and REST APIs, with a track record of measurable impact: cutting infrastructure costs by ~70% through a self-hosted analytics migration and improving debt recovery by 30% via invoice automation. Brings end-to-end ownership across frontend architecture, AWS deployment, CI/CD, and RBAC — with a consistent focus on performance, clean code, and shipping on time.</w:t>
+        <w:t xml:space="preserve">Full Stack Developer with 2+ years building data-intensive internal platforms and subscription portals at scale — currently at a Dubai-based mobility startup. Specialises in React, Node.js, and REST APIs, with a track record of measurable impact: cutting infrastructure costs by ~70% through a self-hosted analytics migration and improving debt recovery by 30% via invoice automation. Brings end-to-end ownership across frontend architecture, AWS deployment, CI/CD, and RBAC — with a consistent focus on performance, clean code, and shipping on time.</w:t>
       </w:r>
     </w:p>
     <w:p>
@@ -160,7 +160,7 @@
           <w:sz w:val="20"/>
           <w:szCs w:val="20"/>
         </w:rPr>
-        <w:t xml:space="preserve">  |  Full Stack Software Developer</w:t>
+        <w:t xml:space="preserve">  |  Full Stack Developer</w:t>
       </w:r>
       <w:r>
         <w:rPr>

</xml_diff>

<commit_message>
Document Udrive production platforms
</commit_message>
<xml_diff>
--- a/Saman_Khan_CV.docx
+++ b/Saman_Khan_CV.docx
@@ -187,43 +187,79 @@
           <w:sz w:val="20"/>
           <w:szCs w:val="20"/>
         </w:rPr>
-        <w:t xml:space="preserve">Project: Internal Dashboard &amp; CMS (Data-Intensive Platform)</w:t>
-      </w:r>
-    </w:p>
-    <w:p>
-      <w:pPr>
-        <w:pStyle w:val="ListParagraph"/>
-        <w:numPr>
-          <w:ilvl w:val="0"/>
-          <w:numId w:val="2"/>
-        </w:numPr>
-        <w:spacing w:after="30" w:before="30"/>
-      </w:pPr>
-      <w:r>
-        <w:rPr>
-          <w:rFonts w:ascii="Arial" w:cs="Arial" w:eastAsia="Arial" w:hAnsi="Arial"/>
-          <w:sz w:val="20"/>
-          <w:szCs w:val="20"/>
-        </w:rPr>
-        <w:t xml:space="preserve">Built scalable, data-driven admin dashboards using React, Redux, Node.js, and REST APIs to manage customers, reservations, vehicles, and real-time pricing.</w:t>
-      </w:r>
-    </w:p>
-    <w:p>
-      <w:pPr>
-        <w:pStyle w:val="ListParagraph"/>
-        <w:numPr>
-          <w:ilvl w:val="0"/>
-          <w:numId w:val="2"/>
-        </w:numPr>
-        <w:spacing w:after="30" w:before="30"/>
-      </w:pPr>
-      <w:r>
-        <w:rPr>
-          <w:rFonts w:ascii="Arial" w:cs="Arial" w:eastAsia="Arial" w:hAnsi="Arial"/>
-          <w:sz w:val="20"/>
-          <w:szCs w:val="20"/>
-        </w:rPr>
-        <w:t xml:space="preserve">Enforced secure authentication and RBAC using JWT/OAuth2, supporting dynamic pricing, CRUD workflows, and protected operational features.</w:t>
+        <w:t xml:space="preserve">Project: UdriveAdmin (Internal Fleet &amp; Operations Platform)</w:t>
+      </w:r>
+    </w:p>
+    <w:p>
+      <w:pPr>
+        <w:pStyle w:val="ListParagraph"/>
+        <w:numPr>
+          <w:ilvl w:val="0"/>
+          <w:numId w:val="2"/>
+        </w:numPr>
+        <w:spacing w:after="30" w:before="30"/>
+      </w:pPr>
+      <w:r>
+        <w:rPr>
+          <w:rFonts w:ascii="Arial" w:cs="Arial" w:eastAsia="Arial" w:hAnsi="Arial"/>
+          <w:sz w:val="20"/>
+          <w:szCs w:val="20"/>
+        </w:rPr>
+        <w:t xml:space="preserve">Modernized UdriveAdmin into a React 19 SPA, migrating from CRACO to Vite 8 and using MUI 5, Emotion, React Router 7, and TanStack React Query 5 across fleet, customer, reservation, billing, claims, and analytics workflows.</w:t>
+      </w:r>
+    </w:p>
+    <w:p>
+      <w:pPr>
+        <w:pStyle w:val="ListParagraph"/>
+        <w:numPr>
+          <w:ilvl w:val="0"/>
+          <w:numId w:val="2"/>
+        </w:numPr>
+        <w:spacing w:after="30" w:before="30"/>
+      </w:pPr>
+      <w:r>
+        <w:rPr>
+          <w:rFonts w:ascii="Arial" w:cs="Arial" w:eastAsia="Arial" w:hAnsi="Arial"/>
+          <w:sz w:val="20"/>
+          <w:szCs w:val="20"/>
+        </w:rPr>
+        <w:t xml:space="preserve">Standardized server-state fetching and caching through reusable React Query hooks and a centralized, environment-driven API client with bearer authentication, unauthorized-session handling, and normalized errors.</w:t>
+      </w:r>
+    </w:p>
+    <w:p>
+      <w:pPr>
+        <w:pStyle w:val="ListParagraph"/>
+        <w:numPr>
+          <w:ilvl w:val="0"/>
+          <w:numId w:val="2"/>
+        </w:numPr>
+        <w:spacing w:after="30" w:before="30"/>
+      </w:pPr>
+      <w:r>
+        <w:rPr>
+          <w:rFonts w:ascii="Arial" w:cs="Arial" w:eastAsia="Arial" w:hAnsi="Arial"/>
+          <w:sz w:val="20"/>
+          <w:szCs w:val="20"/>
+        </w:rPr>
+        <w:t xml:space="preserve">Built live vehicle and cleaning maps with Mapbox GL and MapLibre GL, modular D3 analytics, and PDF-based fine-document workflows.</w:t>
+      </w:r>
+    </w:p>
+    <w:p>
+      <w:pPr>
+        <w:pStyle w:val="ListParagraph"/>
+        <w:numPr>
+          <w:ilvl w:val="0"/>
+          <w:numId w:val="2"/>
+        </w:numPr>
+        <w:spacing w:after="30" w:before="30"/>
+      </w:pPr>
+      <w:r>
+        <w:rPr>
+          <w:rFonts w:ascii="Arial" w:cs="Arial" w:eastAsia="Arial" w:hAnsi="Arial"/>
+          <w:sz w:val="20"/>
+          <w:szCs w:val="20"/>
+        </w:rPr>
+        <w:t xml:space="preserve">Improved reliability and usability with lazy-loaded routes, vendor code-splitting, global toasts, optimistic updates, an ErrorBoundary, reusable empty states, and URL-synced filters.</w:t>
       </w:r>
     </w:p>
     <w:p>
@@ -278,42 +314,6 @@
           <w:szCs w:val="20"/>
         </w:rPr>
         <w:t xml:space="preserve">Designed system-level monitoring dashboards using Apache Kafka with real-time alerts and interactive analytics to improve platform observability.</w:t>
-      </w:r>
-    </w:p>
-    <w:p>
-      <w:pPr>
-        <w:pStyle w:val="ListParagraph"/>
-        <w:numPr>
-          <w:ilvl w:val="0"/>
-          <w:numId w:val="2"/>
-        </w:numPr>
-        <w:spacing w:after="30" w:before="30"/>
-      </w:pPr>
-      <w:r>
-        <w:rPr>
-          <w:rFonts w:ascii="Arial" w:cs="Arial" w:eastAsia="Arial" w:hAnsi="Arial"/>
-          <w:sz w:val="20"/>
-          <w:szCs w:val="20"/>
-        </w:rPr>
-        <w:t xml:space="preserve">Drove frontend performance improvements through component refactoring, lazy loading, and caching, resulting in faster load times and better internal user productivity.</w:t>
-      </w:r>
-    </w:p>
-    <w:p>
-      <w:pPr>
-        <w:pStyle w:val="ListParagraph"/>
-        <w:numPr>
-          <w:ilvl w:val="0"/>
-          <w:numId w:val="2"/>
-        </w:numPr>
-        <w:spacing w:after="30" w:before="30"/>
-      </w:pPr>
-      <w:r>
-        <w:rPr>
-          <w:rFonts w:ascii="Arial" w:cs="Arial" w:eastAsia="Arial" w:hAnsi="Arial"/>
-          <w:sz w:val="20"/>
-          <w:szCs w:val="20"/>
-        </w:rPr>
-        <w:t xml:space="preserve">Maintained code quality and delivery reliability through SOLID/DRY principles, TypeScript, code reviews, automated testing, and CI/CD pipelines.</w:t>
       </w:r>
     </w:p>
     <w:p>
@@ -331,61 +331,61 @@
           <w:sz w:val="20"/>
           <w:szCs w:val="20"/>
         </w:rPr>
-        <w:t xml:space="preserve">Project: Subscription Mobility Admin Portal (Product &amp; UX-Focused Platform)</w:t>
-      </w:r>
-    </w:p>
-    <w:p>
-      <w:pPr>
-        <w:pStyle w:val="ListParagraph"/>
-        <w:numPr>
-          <w:ilvl w:val="0"/>
-          <w:numId w:val="2"/>
-        </w:numPr>
-        <w:spacing w:after="30" w:before="30"/>
-      </w:pPr>
-      <w:r>
-        <w:rPr>
-          <w:rFonts w:ascii="Arial" w:cs="Arial" w:eastAsia="Arial" w:hAnsi="Arial"/>
-          <w:sz w:val="20"/>
-          <w:szCs w:val="20"/>
-        </w:rPr>
-        <w:t xml:space="preserve">Built a responsive vehicle subscription admin portal using React, TypeScript, MUI, and React Router, following a mobile-first design with a fixed navigation layout.</w:t>
-      </w:r>
-    </w:p>
-    <w:p>
-      <w:pPr>
-        <w:pStyle w:val="ListParagraph"/>
-        <w:numPr>
-          <w:ilvl w:val="0"/>
-          <w:numId w:val="2"/>
-        </w:numPr>
-        <w:spacing w:after="30" w:before="30"/>
-      </w:pPr>
-      <w:r>
-        <w:rPr>
-          <w:rFonts w:ascii="Arial" w:cs="Arial" w:eastAsia="Arial" w:hAnsi="Arial"/>
-          <w:sz w:val="20"/>
-          <w:szCs w:val="20"/>
-        </w:rPr>
-        <w:t xml:space="preserve">Owned customer lifecycle management and CRM workflows (Lead → Deal → Active → Completed), integrating KYC, invoicing, fleet onboarding/offboarding, and hardware actions via APIs.</w:t>
-      </w:r>
-    </w:p>
-    <w:p>
-      <w:pPr>
-        <w:pStyle w:val="ListParagraph"/>
-        <w:numPr>
-          <w:ilvl w:val="0"/>
-          <w:numId w:val="2"/>
-        </w:numPr>
-        <w:spacing w:after="30" w:before="30"/>
-      </w:pPr>
-      <w:r>
-        <w:rPr>
-          <w:rFonts w:ascii="Arial" w:cs="Arial" w:eastAsia="Arial" w:hAnsi="Arial"/>
-          <w:sz w:val="20"/>
-          <w:szCs w:val="20"/>
-        </w:rPr>
-        <w:t xml:space="preserve">Enhanced usability with advanced search and filtering, pagination, grid/table view toggles, and optimistic UI updates with real-time feedback.</w:t>
+        <w:t xml:space="preserve">Project: SN Admin (Subscription Operations Platform)</w:t>
+      </w:r>
+    </w:p>
+    <w:p>
+      <w:pPr>
+        <w:pStyle w:val="ListParagraph"/>
+        <w:numPr>
+          <w:ilvl w:val="0"/>
+          <w:numId w:val="2"/>
+        </w:numPr>
+        <w:spacing w:after="30" w:before="30"/>
+      </w:pPr>
+      <w:r>
+        <w:rPr>
+          <w:rFonts w:ascii="Arial" w:cs="Arial" w:eastAsia="Arial" w:hAnsi="Arial"/>
+          <w:sz w:val="20"/>
+          <w:szCs w:val="20"/>
+        </w:rPr>
+        <w:t xml:space="preserve">Built a React 19 operational portal using React Router 7, MUI, Emotion, D3, MapLibre GL, and Framer Motion for leads, customers, vehicles, deals, subscriptions, invoices, products, roles, and release management.</w:t>
+      </w:r>
+    </w:p>
+    <w:p>
+      <w:pPr>
+        <w:pStyle w:val="ListParagraph"/>
+        <w:numPr>
+          <w:ilvl w:val="0"/>
+          <w:numId w:val="2"/>
+        </w:numPr>
+        <w:spacing w:after="30" w:before="30"/>
+      </w:pPr>
+      <w:r>
+        <w:rPr>
+          <w:rFonts w:ascii="Arial" w:cs="Arial" w:eastAsia="Arial" w:hAnsi="Arial"/>
+          <w:sz w:val="20"/>
+          <w:szCs w:val="20"/>
+        </w:rPr>
+        <w:t xml:space="preserve">Structured feature modules around dedicated data hooks, mutation actions, reusable components, and constants; developed the five-stage deals pipeline with filters, editing, preview workflows, WhatsApp quick messaging, and printable reporting.</w:t>
+      </w:r>
+    </w:p>
+    <w:p>
+      <w:pPr>
+        <w:pStyle w:val="ListParagraph"/>
+        <w:numPr>
+          <w:ilvl w:val="0"/>
+          <w:numId w:val="2"/>
+        </w:numPr>
+        <w:spacing w:after="30" w:before="30"/>
+      </w:pPr>
+      <w:r>
+        <w:rPr>
+          <w:rFonts w:ascii="Arial" w:cs="Arial" w:eastAsia="Arial" w:hAnsi="Arial"/>
+          <w:sz w:val="20"/>
+          <w:szCs w:val="20"/>
+        </w:rPr>
+        <w:t xml:space="preserve">Owned subscription lifecycle workflows spanning KYC, invoicing, car assignment, fleet onboarding/offboarding, and vehicle hardware actions.</w:t>
       </w:r>
     </w:p>
     <w:p>
@@ -427,7 +427,7 @@
           <w:sz w:val="19"/>
           <w:szCs w:val="19"/>
         </w:rPr>
-        <w:t xml:space="preserve">React 19, TypeScript, Redux, MUI 5, Framer Motion, Node.js, REST APIs, JWT, Apache Kafka, Apache Airflow, AWS EC2/Route 53/CloudWatch, Nginx, Cloudflare, Apache Superset, GitHub Actions, Jira</w:t>
+        <w:t xml:space="preserve">React 19, TypeScript, TanStack React Query 5, MUI 5/6, Emotion, React Router 7, Vite 8, Framer Motion, Node.js, REST APIs, JWT, Mapbox GL, MapLibre GL, D3, React-PDF, Apache Kafka, Apache Airflow, AWS EC2/Route 53/CloudWatch, Nginx, Cloudflare, Apache Superset, GitHub Actions, Jira</w:t>
       </w:r>
     </w:p>
     <w:p>
@@ -701,7 +701,7 @@
           <w:sz w:val="20"/>
           <w:szCs w:val="20"/>
         </w:rPr>
-        <w:t xml:space="preserve">React.js, TypeScript/JavaScript, Redux, MUI, React Native (Expo), Framer Motion, React Router</w:t>
+        <w:t xml:space="preserve">React 19, TypeScript/JavaScript, TanStack React Query 5, MUI 5/6, Emotion, React Router 7, React Native (Expo), Framer Motion</w:t>
       </w:r>
     </w:p>
     <w:p>
@@ -747,30 +747,30 @@
           <w:sz w:val="20"/>
           <w:szCs w:val="20"/>
         </w:rPr>
-        <w:t xml:space="preserve">AWS (EC2, Route 53, CloudWatch), Nginx, Cloudflare, GitHub Actions (CI/CD), CRACO</w:t>
-      </w:r>
-    </w:p>
-    <w:p>
-      <w:pPr>
-        <w:spacing w:after="30" w:before="30"/>
-      </w:pPr>
-      <w:r>
-        <w:rPr>
-          <w:rFonts w:ascii="Arial" w:cs="Arial" w:eastAsia="Arial" w:hAnsi="Arial"/>
-          <w:b/>
-          <w:bCs/>
-          <w:sz w:val="20"/>
-          <w:szCs w:val="20"/>
-        </w:rPr>
-        <w:t xml:space="preserve">Data &amp; Monitoring: </w:t>
-      </w:r>
-      <w:r>
-        <w:rPr>
-          <w:rFonts w:ascii="Arial" w:cs="Arial" w:eastAsia="Arial" w:hAnsi="Arial"/>
-          <w:sz w:val="20"/>
-          <w:szCs w:val="20"/>
-        </w:rPr>
-        <w:t xml:space="preserve">Apache Kafka, Apache Airflow, Apache Superset, MS SQL Server, Firebase</w:t>
+        <w:t xml:space="preserve">AWS (EC2, Route 53, CloudWatch), Nginx, Cloudflare, GitHub Actions (CI/CD), Vite 8, CRACO</w:t>
+      </w:r>
+    </w:p>
+    <w:p>
+      <w:pPr>
+        <w:spacing w:after="30" w:before="30"/>
+      </w:pPr>
+      <w:r>
+        <w:rPr>
+          <w:rFonts w:ascii="Arial" w:cs="Arial" w:eastAsia="Arial" w:hAnsi="Arial"/>
+          <w:b/>
+          <w:bCs/>
+          <w:sz w:val="20"/>
+          <w:szCs w:val="20"/>
+        </w:rPr>
+        <w:t xml:space="preserve">Data, Maps &amp; Monitoring: </w:t>
+      </w:r>
+      <w:r>
+        <w:rPr>
+          <w:rFonts w:ascii="Arial" w:cs="Arial" w:eastAsia="Arial" w:hAnsi="Arial"/>
+          <w:sz w:val="20"/>
+          <w:szCs w:val="20"/>
+        </w:rPr>
+        <w:t xml:space="preserve">Apache Kafka, Apache Airflow, Apache Superset, Mapbox GL, MapLibre GL, D3, React-PDF, MS SQL Server, Firebase</w:t>
       </w:r>
     </w:p>
     <w:p>

</xml_diff>

<commit_message>
Anonymize current employer and production work
</commit_message>
<xml_diff>
--- a/Saman_Khan_CV.docx
+++ b/Saman_Khan_CV.docx
@@ -109,7 +109,7 @@
           <w:sz w:val="20"/>
           <w:szCs w:val="20"/>
         </w:rPr>
-        <w:t xml:space="preserve">Full Stack Developer with 2+ years building data-intensive internal platforms and subscription portals at scale — currently at a Dubai-based mobility startup. Specialises in React, Node.js, and REST APIs, with a track record of measurable impact: cutting infrastructure costs by ~70% through a self-hosted analytics migration and improving debt recovery by 30% via invoice automation. Brings end-to-end ownership across frontend architecture, AWS deployment, CI/CD, and RBAC — with a consistent focus on performance, clean code, and shipping on time.</w:t>
+        <w:t xml:space="preserve">Full Stack Developer with 2+ years building production web applications and internal platforms. Specialises in React, TypeScript, Node.js, and REST APIs, with end-to-end ownership across frontend architecture, cloud deployment, CI/CD, authentication, and role-based access control. Consistently focused on performance, clean code, reliable delivery, and maintainable user experiences.</w:t>
       </w:r>
     </w:p>
     <w:p>
@@ -143,7 +143,7 @@
           <w:sz w:val="22"/>
           <w:szCs w:val="22"/>
         </w:rPr>
-        <w:t xml:space="preserve">Udrive – Rent-a-Car</w:t>
+        <w:t xml:space="preserve">Current Role</w:t>
       </w:r>
       <w:r>
         <w:rPr>
@@ -187,133 +187,133 @@
           <w:sz w:val="20"/>
           <w:szCs w:val="20"/>
         </w:rPr>
-        <w:t xml:space="preserve">Project: UdriveAdmin (Internal Fleet &amp; Operations Platform)</w:t>
-      </w:r>
-    </w:p>
-    <w:p>
-      <w:pPr>
-        <w:pStyle w:val="ListParagraph"/>
-        <w:numPr>
-          <w:ilvl w:val="0"/>
-          <w:numId w:val="2"/>
-        </w:numPr>
-        <w:spacing w:after="30" w:before="30"/>
-      </w:pPr>
-      <w:r>
-        <w:rPr>
-          <w:rFonts w:ascii="Arial" w:cs="Arial" w:eastAsia="Arial" w:hAnsi="Arial"/>
-          <w:sz w:val="20"/>
-          <w:szCs w:val="20"/>
-        </w:rPr>
-        <w:t xml:space="preserve">Modernized UdriveAdmin into a React 19 SPA, migrating from CRACO to Vite 8 and using MUI 5, Emotion, React Router 7, and TanStack React Query 5 across fleet, customer, reservation, billing, claims, and analytics workflows.</w:t>
-      </w:r>
-    </w:p>
-    <w:p>
-      <w:pPr>
-        <w:pStyle w:val="ListParagraph"/>
-        <w:numPr>
-          <w:ilvl w:val="0"/>
-          <w:numId w:val="2"/>
-        </w:numPr>
-        <w:spacing w:after="30" w:before="30"/>
-      </w:pPr>
-      <w:r>
-        <w:rPr>
-          <w:rFonts w:ascii="Arial" w:cs="Arial" w:eastAsia="Arial" w:hAnsi="Arial"/>
-          <w:sz w:val="20"/>
-          <w:szCs w:val="20"/>
-        </w:rPr>
-        <w:t xml:space="preserve">Standardized server-state fetching and caching through reusable React Query hooks and a centralized, environment-driven API client with bearer authentication, unauthorized-session handling, and normalized errors.</w:t>
-      </w:r>
-    </w:p>
-    <w:p>
-      <w:pPr>
-        <w:pStyle w:val="ListParagraph"/>
-        <w:numPr>
-          <w:ilvl w:val="0"/>
-          <w:numId w:val="2"/>
-        </w:numPr>
-        <w:spacing w:after="30" w:before="30"/>
-      </w:pPr>
-      <w:r>
-        <w:rPr>
-          <w:rFonts w:ascii="Arial" w:cs="Arial" w:eastAsia="Arial" w:hAnsi="Arial"/>
-          <w:sz w:val="20"/>
-          <w:szCs w:val="20"/>
-        </w:rPr>
-        <w:t xml:space="preserve">Built live vehicle and cleaning maps with Mapbox GL and MapLibre GL, modular D3 analytics, and PDF-based fine-document workflows.</w:t>
-      </w:r>
-    </w:p>
-    <w:p>
-      <w:pPr>
-        <w:pStyle w:val="ListParagraph"/>
-        <w:numPr>
-          <w:ilvl w:val="0"/>
-          <w:numId w:val="2"/>
-        </w:numPr>
-        <w:spacing w:after="30" w:before="30"/>
-      </w:pPr>
-      <w:r>
-        <w:rPr>
-          <w:rFonts w:ascii="Arial" w:cs="Arial" w:eastAsia="Arial" w:hAnsi="Arial"/>
-          <w:sz w:val="20"/>
-          <w:szCs w:val="20"/>
-        </w:rPr>
-        <w:t xml:space="preserve">Improved reliability and usability with lazy-loaded routes, vendor code-splitting, global toasts, optimistic updates, an ErrorBoundary, reusable empty states, and URL-synced filters.</w:t>
-      </w:r>
-    </w:p>
-    <w:p>
-      <w:pPr>
-        <w:pStyle w:val="ListParagraph"/>
-        <w:numPr>
-          <w:ilvl w:val="0"/>
-          <w:numId w:val="2"/>
-        </w:numPr>
-        <w:spacing w:after="30" w:before="30"/>
-      </w:pPr>
-      <w:r>
-        <w:rPr>
-          <w:rFonts w:ascii="Arial" w:cs="Arial" w:eastAsia="Arial" w:hAnsi="Arial"/>
-          <w:sz w:val="20"/>
-          <w:szCs w:val="20"/>
-        </w:rPr>
-        <w:t xml:space="preserve">Delivered end-to-end invoice automation with serverless functions, improving debt recovery by 30% and cutting manual operational overhead.</w:t>
-      </w:r>
-    </w:p>
-    <w:p>
-      <w:pPr>
-        <w:pStyle w:val="ListParagraph"/>
-        <w:numPr>
-          <w:ilvl w:val="0"/>
-          <w:numId w:val="2"/>
-        </w:numPr>
-        <w:spacing w:after="30" w:before="30"/>
-      </w:pPr>
-      <w:r>
-        <w:rPr>
-          <w:rFonts w:ascii="Arial" w:cs="Arial" w:eastAsia="Arial" w:hAnsi="Arial"/>
-          <w:sz w:val="20"/>
-          <w:szCs w:val="20"/>
-        </w:rPr>
-        <w:t xml:space="preserve">Migrated analytics to self-hosted Apache Superset, designing secure data pipelines and auth layers — achieving ~70% infrastructure cost reduction.</w:t>
-      </w:r>
-    </w:p>
-    <w:p>
-      <w:pPr>
-        <w:pStyle w:val="ListParagraph"/>
-        <w:numPr>
-          <w:ilvl w:val="0"/>
-          <w:numId w:val="2"/>
-        </w:numPr>
-        <w:spacing w:after="30" w:before="30"/>
-      </w:pPr>
-      <w:r>
-        <w:rPr>
-          <w:rFonts w:ascii="Arial" w:cs="Arial" w:eastAsia="Arial" w:hAnsi="Arial"/>
-          <w:sz w:val="20"/>
-          <w:szCs w:val="20"/>
-        </w:rPr>
-        <w:t xml:space="preserve">Designed system-level monitoring dashboards using Apache Kafka with real-time alerts and interactive analytics to improve platform observability.</w:t>
+        <w:t xml:space="preserve">Project: Production Web Platforms</w:t>
+      </w:r>
+    </w:p>
+    <w:p>
+      <w:pPr>
+        <w:pStyle w:val="ListParagraph"/>
+        <w:numPr>
+          <w:ilvl w:val="0"/>
+          <w:numId w:val="2"/>
+        </w:numPr>
+        <w:spacing w:after="30" w:before="30"/>
+      </w:pPr>
+      <w:r>
+        <w:rPr>
+          <w:rFonts w:ascii="Arial" w:cs="Arial" w:eastAsia="Arial" w:hAnsi="Arial"/>
+          <w:sz w:val="20"/>
+          <w:szCs w:val="20"/>
+        </w:rPr>
+        <w:t xml:space="preserve">Build and maintain production admin platforms using React 19, TypeScript, MUI, Emotion, and React Router 7.</w:t>
+      </w:r>
+    </w:p>
+    <w:p>
+      <w:pPr>
+        <w:pStyle w:val="ListParagraph"/>
+        <w:numPr>
+          <w:ilvl w:val="0"/>
+          <w:numId w:val="2"/>
+        </w:numPr>
+        <w:spacing w:after="30" w:before="30"/>
+      </w:pPr>
+      <w:r>
+        <w:rPr>
+          <w:rFonts w:ascii="Arial" w:cs="Arial" w:eastAsia="Arial" w:hAnsi="Arial"/>
+          <w:sz w:val="20"/>
+          <w:szCs w:val="20"/>
+        </w:rPr>
+        <w:t xml:space="preserve">Modernized frontend tooling from a legacy CRACO setup to Vite 8, adding lazy-loaded routes and vendor code-splitting.</w:t>
+      </w:r>
+    </w:p>
+    <w:p>
+      <w:pPr>
+        <w:pStyle w:val="ListParagraph"/>
+        <w:numPr>
+          <w:ilvl w:val="0"/>
+          <w:numId w:val="2"/>
+        </w:numPr>
+        <w:spacing w:after="30" w:before="30"/>
+      </w:pPr>
+      <w:r>
+        <w:rPr>
+          <w:rFonts w:ascii="Arial" w:cs="Arial" w:eastAsia="Arial" w:hAnsi="Arial"/>
+          <w:sz w:val="20"/>
+          <w:szCs w:val="20"/>
+        </w:rPr>
+        <w:t xml:space="preserve">Standardized server-state fetching and caching through reusable React Query hooks and a centralized, environment-driven API client.</w:t>
+      </w:r>
+    </w:p>
+    <w:p>
+      <w:pPr>
+        <w:pStyle w:val="ListParagraph"/>
+        <w:numPr>
+          <w:ilvl w:val="0"/>
+          <w:numId w:val="2"/>
+        </w:numPr>
+        <w:spacing w:after="30" w:before="30"/>
+      </w:pPr>
+      <w:r>
+        <w:rPr>
+          <w:rFonts w:ascii="Arial" w:cs="Arial" w:eastAsia="Arial" w:hAnsi="Arial"/>
+          <w:sz w:val="20"/>
+          <w:szCs w:val="20"/>
+        </w:rPr>
+        <w:t xml:space="preserve">Developed shared application infrastructure for authentication behavior, error normalization, protected routes, and role-based access.</w:t>
+      </w:r>
+    </w:p>
+    <w:p>
+      <w:pPr>
+        <w:pStyle w:val="ListParagraph"/>
+        <w:numPr>
+          <w:ilvl w:val="0"/>
+          <w:numId w:val="2"/>
+        </w:numPr>
+        <w:spacing w:after="30" w:before="30"/>
+      </w:pPr>
+      <w:r>
+        <w:rPr>
+          <w:rFonts w:ascii="Arial" w:cs="Arial" w:eastAsia="Arial" w:hAnsi="Arial"/>
+          <w:sz w:val="20"/>
+          <w:szCs w:val="20"/>
+        </w:rPr>
+        <w:t xml:space="preserve">Built reusable map, data-visualization, and document interfaces with Mapbox GL, MapLibre GL, D3, and React-PDF.</w:t>
+      </w:r>
+    </w:p>
+    <w:p>
+      <w:pPr>
+        <w:pStyle w:val="ListParagraph"/>
+        <w:numPr>
+          <w:ilvl w:val="0"/>
+          <w:numId w:val="2"/>
+        </w:numPr>
+        <w:spacing w:after="30" w:before="30"/>
+      </w:pPr>
+      <w:r>
+        <w:rPr>
+          <w:rFonts w:ascii="Arial" w:cs="Arial" w:eastAsia="Arial" w:hAnsi="Arial"/>
+          <w:sz w:val="20"/>
+          <w:szCs w:val="20"/>
+        </w:rPr>
+        <w:t xml:space="preserve">Improved reliability and usability with global toasts, optimistic updates, an ErrorBoundary, reusable empty states, and URL-synced filters.</w:t>
+      </w:r>
+    </w:p>
+    <w:p>
+      <w:pPr>
+        <w:pStyle w:val="ListParagraph"/>
+        <w:numPr>
+          <w:ilvl w:val="0"/>
+          <w:numId w:val="2"/>
+        </w:numPr>
+        <w:spacing w:after="30" w:before="30"/>
+      </w:pPr>
+      <w:r>
+        <w:rPr>
+          <w:rFonts w:ascii="Arial" w:cs="Arial" w:eastAsia="Arial" w:hAnsi="Arial"/>
+          <w:sz w:val="20"/>
+          <w:szCs w:val="20"/>
+        </w:rPr>
+        <w:t xml:space="preserve">Maintained code quality through TypeScript, reusable architecture, code reviews, automated testing, and CI/CD workflows.</w:t>
       </w:r>
     </w:p>
     <w:p>
@@ -331,79 +331,79 @@
           <w:sz w:val="20"/>
           <w:szCs w:val="20"/>
         </w:rPr>
-        <w:t xml:space="preserve">Project: SN Admin (Subscription Operations Platform)</w:t>
-      </w:r>
-    </w:p>
-    <w:p>
-      <w:pPr>
-        <w:pStyle w:val="ListParagraph"/>
-        <w:numPr>
-          <w:ilvl w:val="0"/>
-          <w:numId w:val="2"/>
-        </w:numPr>
-        <w:spacing w:after="30" w:before="30"/>
-      </w:pPr>
-      <w:r>
-        <w:rPr>
-          <w:rFonts w:ascii="Arial" w:cs="Arial" w:eastAsia="Arial" w:hAnsi="Arial"/>
-          <w:sz w:val="20"/>
-          <w:szCs w:val="20"/>
-        </w:rPr>
-        <w:t xml:space="preserve">Built a React 19 operational portal using React Router 7, MUI, Emotion, D3, MapLibre GL, and Framer Motion for leads, customers, vehicles, deals, subscriptions, invoices, products, roles, and release management.</w:t>
-      </w:r>
-    </w:p>
-    <w:p>
-      <w:pPr>
-        <w:pStyle w:val="ListParagraph"/>
-        <w:numPr>
-          <w:ilvl w:val="0"/>
-          <w:numId w:val="2"/>
-        </w:numPr>
-        <w:spacing w:after="30" w:before="30"/>
-      </w:pPr>
-      <w:r>
-        <w:rPr>
-          <w:rFonts w:ascii="Arial" w:cs="Arial" w:eastAsia="Arial" w:hAnsi="Arial"/>
-          <w:sz w:val="20"/>
-          <w:szCs w:val="20"/>
-        </w:rPr>
-        <w:t xml:space="preserve">Structured feature modules around dedicated data hooks, mutation actions, reusable components, and constants; developed the five-stage deals pipeline with filters, editing, preview workflows, WhatsApp quick messaging, and printable reporting.</w:t>
-      </w:r>
-    </w:p>
-    <w:p>
-      <w:pPr>
-        <w:pStyle w:val="ListParagraph"/>
-        <w:numPr>
-          <w:ilvl w:val="0"/>
-          <w:numId w:val="2"/>
-        </w:numPr>
-        <w:spacing w:after="30" w:before="30"/>
-      </w:pPr>
-      <w:r>
-        <w:rPr>
-          <w:rFonts w:ascii="Arial" w:cs="Arial" w:eastAsia="Arial" w:hAnsi="Arial"/>
-          <w:sz w:val="20"/>
-          <w:szCs w:val="20"/>
-        </w:rPr>
-        <w:t xml:space="preserve">Owned subscription lifecycle workflows spanning KYC, invoicing, car assignment, fleet onboarding/offboarding, and vehicle hardware actions.</w:t>
-      </w:r>
-    </w:p>
-    <w:p>
-      <w:pPr>
-        <w:pStyle w:val="ListParagraph"/>
-        <w:numPr>
-          <w:ilvl w:val="0"/>
-          <w:numId w:val="2"/>
-        </w:numPr>
-        <w:spacing w:after="30" w:before="30"/>
-      </w:pPr>
-      <w:r>
-        <w:rPr>
-          <w:rFonts w:ascii="Arial" w:cs="Arial" w:eastAsia="Arial" w:hAnsi="Arial"/>
-          <w:sz w:val="20"/>
-          <w:szCs w:val="20"/>
-        </w:rPr>
-        <w:t xml:space="preserve">Deployed to AWS EC2 using CRA + CRACO, configured Nginx, and secured production traffic with HTTPS (Certbot).</w:t>
+        <w:t xml:space="preserve">Project: Frontend Architecture &amp; Delivery</w:t>
+      </w:r>
+    </w:p>
+    <w:p>
+      <w:pPr>
+        <w:pStyle w:val="ListParagraph"/>
+        <w:numPr>
+          <w:ilvl w:val="0"/>
+          <w:numId w:val="2"/>
+        </w:numPr>
+        <w:spacing w:after="30" w:before="30"/>
+      </w:pPr>
+      <w:r>
+        <w:rPr>
+          <w:rFonts w:ascii="Arial" w:cs="Arial" w:eastAsia="Arial" w:hAnsi="Arial"/>
+          <w:sz w:val="20"/>
+          <w:szCs w:val="20"/>
+        </w:rPr>
+        <w:t xml:space="preserve">Structured feature areas around dedicated data hooks, mutation actions, reusable components, constants, and protected routes.</w:t>
+      </w:r>
+    </w:p>
+    <w:p>
+      <w:pPr>
+        <w:pStyle w:val="ListParagraph"/>
+        <w:numPr>
+          <w:ilvl w:val="0"/>
+          <w:numId w:val="2"/>
+        </w:numPr>
+        <w:spacing w:after="30" w:before="30"/>
+      </w:pPr>
+      <w:r>
+        <w:rPr>
+          <w:rFonts w:ascii="Arial" w:cs="Arial" w:eastAsia="Arial" w:hAnsi="Arial"/>
+          <w:sz w:val="20"/>
+          <w:szCs w:val="20"/>
+        </w:rPr>
+        <w:t xml:space="preserve">Built responsive interfaces with clear loading, empty, error, success, and optimistic interaction states.</w:t>
+      </w:r>
+    </w:p>
+    <w:p>
+      <w:pPr>
+        <w:pStyle w:val="ListParagraph"/>
+        <w:numPr>
+          <w:ilvl w:val="0"/>
+          <w:numId w:val="2"/>
+        </w:numPr>
+        <w:spacing w:after="30" w:before="30"/>
+      </w:pPr>
+      <w:r>
+        <w:rPr>
+          <w:rFonts w:ascii="Arial" w:cs="Arial" w:eastAsia="Arial" w:hAnsi="Arial"/>
+          <w:sz w:val="20"/>
+          <w:szCs w:val="20"/>
+        </w:rPr>
+        <w:t xml:space="preserve">Implemented shareable URL-synced filters, modular navigation, authentication checks, and role-aware UI behavior.</w:t>
+      </w:r>
+    </w:p>
+    <w:p>
+      <w:pPr>
+        <w:pStyle w:val="ListParagraph"/>
+        <w:numPr>
+          <w:ilvl w:val="0"/>
+          <w:numId w:val="2"/>
+        </w:numPr>
+        <w:spacing w:after="30" w:before="30"/>
+      </w:pPr>
+      <w:r>
+        <w:rPr>
+          <w:rFonts w:ascii="Arial" w:cs="Arial" w:eastAsia="Arial" w:hAnsi="Arial"/>
+          <w:sz w:val="20"/>
+          <w:szCs w:val="20"/>
+        </w:rPr>
+        <w:t xml:space="preserve">Contributed to production delivery through cloud infrastructure, reverse proxy configuration, HTTPS, and CI/CD workflows.</w:t>
       </w:r>
     </w:p>
     <w:p>
@@ -418,7 +418,7 @@
           <w:sz w:val="19"/>
           <w:szCs w:val="19"/>
         </w:rPr>
-        <w:t xml:space="preserve">Tech Stack: </w:t>
+        <w:t xml:space="preserve">Focus Areas: </w:t>
       </w:r>
       <w:r>
         <w:rPr>
@@ -427,7 +427,7 @@
           <w:sz w:val="19"/>
           <w:szCs w:val="19"/>
         </w:rPr>
-        <w:t xml:space="preserve">React 19, TypeScript, TanStack React Query 5, MUI 5/6, Emotion, React Router 7, Vite 8, Framer Motion, Node.js, REST APIs, JWT, Mapbox GL, MapLibre GL, D3, React-PDF, Apache Kafka, Apache Airflow, AWS EC2/Route 53/CloudWatch, Nginx, Cloudflare, Apache Superset, GitHub Actions, Jira</w:t>
+        <w:t xml:space="preserve">React, TypeScript, frontend architecture, server-state management, API integration, authentication, cloud deployment, testing, and CI/CD</w:t>
       </w:r>
     </w:p>
     <w:p>

</xml_diff>